<commit_message>
Word report: figure crops contain only the figure, no body text (#72)
The PDF crops reached up to 380pt above each caption, so 9 of the 12 PNGs
also carried the content above the figure: Table 1 (fig01), Table 5 and
prose (fig02), the 2.3 heading and prose (fig03), prose (fig04, fig08,
fig10, fig12), all of Figure 5 + 3.2 heading + Table 7 (fig06), Table 8
(fig07), and Figure 9 + its caption (fig10). Word then showed those
paragraphs, tables and figures twice, which is most of the extra pages.

- Trim the checked-in crops to the figure block (panel titles and legends
  kept), and rebuild Bayan_Final_Report.docx: ~28 in less image height.
- extract_figures.py: bound crops by drawings/images only, with the
  nearest prose/caption/table block above as a hard ceiling; text is only
  taken when it hugs the graphics (labels). Never grows upward from text.

Co-Authored-By: Claude Opus 5.5 <noreply@anthropic.com>
</commit_message>
<xml_diff>
--- a/deliverables/03_final_report/Bayan_Final_Report.docx
+++ b/deliverables/03_final_report/Bayan_Final_Report.docx
@@ -4238,7 +4238,7 @@
       <w:r>
         <w:drawing xmlns:a="http://schemas.openxmlformats.org/drawingml/2006/main" xmlns:pic="http://schemas.openxmlformats.org/drawingml/2006/picture">
           <wp:inline distT="0" distB="0" distL="0" distR="0">
-            <wp:extent cx="5735955" cy="5879637"/>
+            <wp:extent cx="5735955" cy="2113644"/>
             <wp:effectExtent l="0" t="0" r="0" b="0"/>
             <wp:docPr id="1001" name="Figure 1001"/>
             <wp:cNvGraphicFramePr>
@@ -4260,7 +4260,7 @@
                   <pic:spPr>
                     <a:xfrm>
                       <a:off x="0" y="0"/>
-                      <a:ext cx="5735955" cy="5879637"/>
+                      <a:ext cx="5735955" cy="2113644"/>
                     </a:xfrm>
                     <a:prstGeom prst="rect">
                       <a:avLst/>
@@ -8964,7 +8964,7 @@
       <w:r>
         <w:drawing xmlns:a="http://schemas.openxmlformats.org/drawingml/2006/main" xmlns:pic="http://schemas.openxmlformats.org/drawingml/2006/picture">
           <wp:inline distT="0" distB="0" distL="0" distR="0">
-            <wp:extent cx="5735955" cy="4450375"/>
+            <wp:extent cx="5735955" cy="2026678"/>
             <wp:effectExtent l="0" t="0" r="0" b="0"/>
             <wp:docPr id="1002" name="Figure 1002"/>
             <wp:cNvGraphicFramePr>
@@ -8986,7 +8986,7 @@
                   <pic:spPr>
                     <a:xfrm>
                       <a:off x="0" y="0"/>
-                      <a:ext cx="5735955" cy="4450375"/>
+                      <a:ext cx="5735955" cy="2026678"/>
                     </a:xfrm>
                     <a:prstGeom prst="rect">
                       <a:avLst/>
@@ -10660,7 +10660,7 @@
       <w:r>
         <w:drawing xmlns:a="http://schemas.openxmlformats.org/drawingml/2006/main" xmlns:pic="http://schemas.openxmlformats.org/drawingml/2006/picture">
           <wp:inline distT="0" distB="0" distL="0" distR="0">
-            <wp:extent cx="5735955" cy="4751566"/>
+            <wp:extent cx="5735955" cy="2866084"/>
             <wp:effectExtent l="0" t="0" r="0" b="0"/>
             <wp:docPr id="1003" name="Figure 1003"/>
             <wp:cNvGraphicFramePr>
@@ -10682,7 +10682,7 @@
                   <pic:spPr>
                     <a:xfrm>
                       <a:off x="0" y="0"/>
-                      <a:ext cx="5735955" cy="4751566"/>
+                      <a:ext cx="5735955" cy="2866084"/>
                     </a:xfrm>
                     <a:prstGeom prst="rect">
                       <a:avLst/>
@@ -10984,7 +10984,7 @@
       <w:r>
         <w:drawing xmlns:a="http://schemas.openxmlformats.org/drawingml/2006/main" xmlns:pic="http://schemas.openxmlformats.org/drawingml/2006/picture">
           <wp:inline distT="0" distB="0" distL="0" distR="0">
-            <wp:extent cx="5735955" cy="4538918"/>
+            <wp:extent cx="5735955" cy="2329877"/>
             <wp:effectExtent l="0" t="0" r="0" b="0"/>
             <wp:docPr id="1004" name="Figure 1004"/>
             <wp:cNvGraphicFramePr>
@@ -11006,7 +11006,7 @@
                   <pic:spPr>
                     <a:xfrm>
                       <a:off x="0" y="0"/>
-                      <a:ext cx="5735955" cy="4538918"/>
+                      <a:ext cx="5735955" cy="2329877"/>
                     </a:xfrm>
                     <a:prstGeom prst="rect">
                       <a:avLst/>
@@ -12402,7 +12402,7 @@
       <w:r>
         <w:drawing xmlns:a="http://schemas.openxmlformats.org/drawingml/2006/main" xmlns:pic="http://schemas.openxmlformats.org/drawingml/2006/picture">
           <wp:inline distT="0" distB="0" distL="0" distR="0">
-            <wp:extent cx="5735955" cy="6719045"/>
+            <wp:extent cx="5735955" cy="1867871"/>
             <wp:effectExtent l="0" t="0" r="0" b="0"/>
             <wp:docPr id="1006" name="Figure 1006"/>
             <wp:cNvGraphicFramePr>
@@ -12424,7 +12424,7 @@
                   <pic:spPr>
                     <a:xfrm>
                       <a:off x="0" y="0"/>
-                      <a:ext cx="5735955" cy="6719045"/>
+                      <a:ext cx="5735955" cy="1867871"/>
                     </a:xfrm>
                     <a:prstGeom prst="rect">
                       <a:avLst/>
@@ -14134,7 +14134,7 @@
       <w:r>
         <w:drawing xmlns:a="http://schemas.openxmlformats.org/drawingml/2006/main" xmlns:pic="http://schemas.openxmlformats.org/drawingml/2006/picture">
           <wp:inline distT="0" distB="0" distL="0" distR="0">
-            <wp:extent cx="5735955" cy="5062916"/>
+            <wp:extent cx="5735955" cy="2003992"/>
             <wp:effectExtent l="0" t="0" r="0" b="0"/>
             <wp:docPr id="1007" name="Figure 1007"/>
             <wp:cNvGraphicFramePr>
@@ -14156,7 +14156,7 @@
                   <pic:spPr>
                     <a:xfrm>
                       <a:off x="0" y="0"/>
-                      <a:ext cx="5735955" cy="5062916"/>
+                      <a:ext cx="5735955" cy="2003992"/>
                     </a:xfrm>
                     <a:prstGeom prst="rect">
                       <a:avLst/>
@@ -14366,7 +14366,7 @@
       <w:r>
         <w:drawing xmlns:a="http://schemas.openxmlformats.org/drawingml/2006/main" xmlns:pic="http://schemas.openxmlformats.org/drawingml/2006/picture">
           <wp:inline distT="0" distB="0" distL="0" distR="0">
-            <wp:extent cx="5735955" cy="3386332"/>
+            <wp:extent cx="5735955" cy="2308003"/>
             <wp:effectExtent l="0" t="0" r="0" b="0"/>
             <wp:docPr id="1008" name="Figure 1008"/>
             <wp:cNvGraphicFramePr>
@@ -14388,7 +14388,7 @@
                   <pic:spPr>
                     <a:xfrm>
                       <a:off x="0" y="0"/>
-                      <a:ext cx="5735955" cy="3386332"/>
+                      <a:ext cx="5735955" cy="2308003"/>
                     </a:xfrm>
                     <a:prstGeom prst="rect">
                       <a:avLst/>
@@ -15428,7 +15428,7 @@
       <w:r>
         <w:drawing xmlns:a="http://schemas.openxmlformats.org/drawingml/2006/main" xmlns:pic="http://schemas.openxmlformats.org/drawingml/2006/picture">
           <wp:inline distT="0" distB="0" distL="0" distR="0">
-            <wp:extent cx="5735955" cy="5580622"/>
+            <wp:extent cx="5735955" cy="2170873"/>
             <wp:effectExtent l="0" t="0" r="0" b="0"/>
             <wp:docPr id="1010" name="Figure 1010"/>
             <wp:cNvGraphicFramePr>
@@ -15450,7 +15450,7 @@
                   <pic:spPr>
                     <a:xfrm>
                       <a:off x="0" y="0"/>
-                      <a:ext cx="5735955" cy="5580622"/>
+                      <a:ext cx="5735955" cy="2170873"/>
                     </a:xfrm>
                     <a:prstGeom prst="rect">
                       <a:avLst/>
@@ -25514,7 +25514,7 @@
       <w:r>
         <w:drawing xmlns:a="http://schemas.openxmlformats.org/drawingml/2006/main" xmlns:pic="http://schemas.openxmlformats.org/drawingml/2006/picture">
           <wp:inline distT="0" distB="0" distL="0" distR="0">
-            <wp:extent cx="5735955" cy="5630013"/>
+            <wp:extent cx="5735955" cy="2981485"/>
             <wp:effectExtent l="0" t="0" r="0" b="0"/>
             <wp:docPr id="1012" name="Figure 1012"/>
             <wp:cNvGraphicFramePr>
@@ -25536,7 +25536,7 @@
                   <pic:spPr>
                     <a:xfrm>
                       <a:off x="0" y="0"/>
-                      <a:ext cx="5735955" cy="5630013"/>
+                      <a:ext cx="5735955" cy="2981485"/>
                     </a:xfrm>
                     <a:prstGeom prst="rect">
                       <a:avLst/>

</xml_diff>

<commit_message>
Word report: team photos and member reviews in section 5, as in LaTeX (#72)
Section 5 still had the template placeholders ("<ATTACH A TEAM PICTURE
HERE>" and an empty NAME / REVIEW table). Build it from main.tex instead:

- photo row from \member{file}{Name}: assets/team images clipped to the
  inscribed circle (22 mm, like the TikZ \clip), names in bold below,
  in the LaTeX order (Bayan symbol for members without a photo);
- "Team Cogni" line, then the NAME / REVIEW and COMMENT table with every
  member's review (macros such as \vThree{} expanded);
- the template's section 5 banner and the section 6 instructor table stay.

Co-Authored-By: Claude Opus 5.5 <noreply@anthropic.com>
</commit_message>
<xml_diff>
--- a/deliverables/03_final_report/Bayan_Final_Report.docx
+++ b/deliverables/03_final_report/Bayan_Final_Report.docx
@@ -31138,57 +31138,27 @@
         </w:sdtContent>
       </w:sdt>
     </w:p>
-    <w:sdt>
-      <w:sdtPr>
-        <w:rPr>
-          <w:rFonts w:ascii="SamsungOne-400" w:hAnsi="SamsungOne-400" w:cs="Times New Roman"/>
-          <w:sz w:val="18"/>
-          <w:szCs w:val="20"/>
-        </w:rPr>
-        <w:tag w:val="goog_rdk_412"/>
-        <w:id w:val="393170479"/>
-        <w:showingPlcHdr/>
-      </w:sdtPr>
-      <w:sdtEndPr/>
-      <w:sdtContent>
-        <w:p>
-          <w:pPr>
-            <w:widowControl/>
-            <w:jc w:val="left"/>
-            <w:rPr>
-              <w:rFonts w:ascii="SamsungOne-400" w:hAnsi="SamsungOne-400" w:cs="Times New Roman"/>
-              <w:sz w:val="28"/>
-              <w:szCs w:val="28"/>
-            </w:rPr>
-          </w:pPr>
-          <w:r>
-            <w:rPr>
-              <w:rFonts w:ascii="SamsungOne-400" w:hAnsi="SamsungOne-400" w:cs="Times New Roman"/>
-              <w:sz w:val="18"/>
-              <w:szCs w:val="20"/>
-            </w:rPr>
-            <w:t xml:space="preserve">     </w:t>
-          </w:r>
-        </w:p>
-      </w:sdtContent>
-    </w:sdt>
     <w:tbl>
       <w:tblPr>
-        <w:tblStyle w:val="af9"/>
         <w:tblW w:w="9010" w:type="dxa"/>
+        <w:jc w:val="center"/>
         <w:tblBorders>
-          <w:top w:val="single" w:sz="4" w:space="0" w:color="000000"/>
-          <w:left w:val="single" w:sz="4" w:space="0" w:color="000000"/>
-          <w:bottom w:val="single" w:sz="4" w:space="0" w:color="000000"/>
-          <w:right w:val="single" w:sz="4" w:space="0" w:color="000000"/>
-          <w:insideH w:val="single" w:sz="4" w:space="0" w:color="000000"/>
-          <w:insideV w:val="single" w:sz="4" w:space="0" w:color="000000"/>
+          <w:top w:val="nil"/>
+          <w:left w:val="nil"/>
+          <w:bottom w:val="nil"/>
+          <w:right w:val="nil"/>
+          <w:insideH w:val="nil"/>
+          <w:insideV w:val="nil"/>
         </w:tblBorders>
         <w:tblLayout w:type="fixed"/>
-        <w:tblLook w:val="0400" w:firstRow="0" w:lastRow="0" w:firstColumn="0" w:lastColumn="0" w:noHBand="0" w:noVBand="1"/>
       </w:tblPr>
       <w:tblGrid>
-        <w:gridCol w:w="9010"/>
+        <w:gridCol w:w="1501"/>
+        <w:gridCol w:w="1501"/>
+        <w:gridCol w:w="1501"/>
+        <w:gridCol w:w="1501"/>
+        <w:gridCol w:w="1501"/>
+        <w:gridCol w:w="1501"/>
       </w:tblGrid>
       <w:tr>
         <w:trPr>
@@ -31197,505 +31167,884 @@
         </w:trPr>
         <w:tc>
           <w:tcPr>
-            <w:tcW w:w="9010" w:type="dxa"/>
-            <w:tcBorders>
-              <w:top w:val="single" w:sz="4" w:space="0" w:color="BFBFBF" w:themeColor="background1" w:themeShade="BF"/>
-              <w:left w:val="single" w:sz="4" w:space="0" w:color="BFBFBF" w:themeColor="background1" w:themeShade="BF"/>
-              <w:bottom w:val="single" w:sz="4" w:space="0" w:color="BFBFBF" w:themeColor="background1" w:themeShade="BF"/>
-              <w:right w:val="single" w:sz="4" w:space="0" w:color="BFBFBF" w:themeColor="background1" w:themeShade="BF"/>
-            </w:tcBorders>
-          </w:tcPr>
-          <w:sdt>
-            <w:sdtPr>
-              <w:rPr>
-                <w:rFonts w:ascii="SamsungOne-400" w:hAnsi="SamsungOne-400" w:cs="Times New Roman"/>
-                <w:sz w:val="18"/>
-                <w:szCs w:val="20"/>
-              </w:rPr>
-              <w:tag w:val="goog_rdk_413"/>
-              <w:id w:val="-1395664091"/>
-            </w:sdtPr>
-            <w:sdtEndPr/>
-            <w:sdtContent>
-              <w:p>
-                <w:pPr>
-                  <w:widowControl/>
-                  <w:jc w:val="center"/>
-                  <w:rPr>
-                    <w:rFonts w:ascii="SamsungOne-400" w:hAnsi="SamsungOne-400" w:cs="Times New Roman"/>
-                    <w:sz w:val="18"/>
-                    <w:szCs w:val="20"/>
-                  </w:rPr>
-                </w:pPr>
-              </w:p>
-              <w:p>
-                <w:pPr>
-                  <w:widowControl/>
-                  <w:jc w:val="center"/>
-                  <w:rPr>
-                    <w:rFonts w:ascii="SamsungOne-400" w:hAnsi="SamsungOne-400" w:cs="Times New Roman"/>
-                    <w:sz w:val="18"/>
-                    <w:szCs w:val="20"/>
-                  </w:rPr>
-                </w:pPr>
-              </w:p>
-              <w:p>
-                <w:pPr>
-                  <w:widowControl/>
-                  <w:jc w:val="center"/>
-                  <w:rPr>
-                    <w:rFonts w:ascii="SamsungOne-400" w:hAnsi="SamsungOne-400" w:cs="Times New Roman"/>
-                    <w:sz w:val="18"/>
-                    <w:szCs w:val="20"/>
-                  </w:rPr>
-                </w:pPr>
-              </w:p>
-              <w:p>
-                <w:pPr>
-                  <w:widowControl/>
-                  <w:jc w:val="center"/>
-                  <w:rPr>
-                    <w:rFonts w:ascii="SamsungOne-400" w:hAnsi="SamsungOne-400" w:cs="Times New Roman"/>
-                    <w:color w:val="BFBFBF" w:themeColor="background1" w:themeShade="BF"/>
-                    <w:sz w:val="28"/>
-                    <w:szCs w:val="28"/>
-                  </w:rPr>
-                </w:pPr>
-                <w:r>
-                  <w:rPr>
-                    <w:rFonts w:ascii="SamsungOne-400" w:hAnsi="SamsungOne-400" w:cs="Times New Roman"/>
-                    <w:color w:val="BFBFBF" w:themeColor="background1" w:themeShade="BF"/>
-                    <w:sz w:val="28"/>
-                    <w:szCs w:val="28"/>
-                  </w:rPr>
-                  <w:t>&lt;ATTACH A TEAM PICTURE HERE&gt;</w:t>
-                </w:r>
-              </w:p>
-              <w:p>
-                <w:pPr>
-                  <w:widowControl/>
-                  <w:jc w:val="center"/>
-                  <w:rPr>
-                    <w:rFonts w:ascii="SamsungOne-400" w:hAnsi="SamsungOne-400" w:cs="Times New Roman"/>
-                    <w:sz w:val="18"/>
-                    <w:szCs w:val="20"/>
-                  </w:rPr>
-                </w:pPr>
-              </w:p>
-              <w:p>
-                <w:pPr>
-                  <w:widowControl/>
-                  <w:jc w:val="center"/>
-                  <w:rPr>
-                    <w:rFonts w:ascii="SamsungOne-400" w:hAnsi="SamsungOne-400" w:cs="Times New Roman"/>
-                    <w:sz w:val="18"/>
-                    <w:szCs w:val="20"/>
-                  </w:rPr>
-                </w:pPr>
-              </w:p>
-              <w:p>
-                <w:pPr>
-                  <w:widowControl/>
-                  <w:jc w:val="center"/>
-                  <w:rPr>
-                    <w:rFonts w:ascii="SamsungOne-400" w:hAnsi="SamsungOne-400" w:cs="Times New Roman"/>
-                    <w:sz w:val="18"/>
-                    <w:szCs w:val="20"/>
-                  </w:rPr>
-                </w:pPr>
-              </w:p>
-            </w:sdtContent>
-          </w:sdt>
+            <w:tcW w:w="1501" w:type="dxa"/>
+          </w:tcPr>
+          <w:p>
+            <w:pPr>
+              <w:spacing w:before="0" w:after="60" w:line="0" w:lineRule="auto"/>
+              <w:jc w:val="center"/>
+            </w:pPr>
+            <w:r>
+              <w:drawing xmlns:a="http://schemas.openxmlformats.org/drawingml/2006/main" xmlns:pic="http://schemas.openxmlformats.org/drawingml/2006/picture">
+                <wp:inline distT="0" distB="0" distL="0" distR="0">
+                  <wp:extent cx="792000" cy="792000"/>
+                  <wp:effectExtent l="0" t="0" r="0" b="0"/>
+                  <wp:docPr id="1013" name="Figure 1013"/>
+                  <wp:cNvGraphicFramePr>
+                    <a:graphicFrameLocks noChangeAspect="1"/>
+                  </wp:cNvGraphicFramePr>
+                  <a:graphic>
+                    <a:graphicData uri="http://schemas.openxmlformats.org/drawingml/2006/picture">
+                      <pic:pic>
+                        <pic:nvPicPr>
+                          <pic:cNvPr id="1013" name="fig1013.png"/>
+                          <pic:cNvPicPr/>
+                        </pic:nvPicPr>
+                        <pic:blipFill>
+                          <a:blip r:embed="rId212"/>
+                          <a:stretch>
+                            <a:fillRect/>
+                          </a:stretch>
+                        </pic:blipFill>
+                        <pic:spPr>
+                          <a:xfrm>
+                            <a:off x="0" y="0"/>
+                            <a:ext cx="792000" cy="792000"/>
+                          </a:xfrm>
+                          <a:prstGeom prst="rect">
+                            <a:avLst/>
+                          </a:prstGeom>
+                        </pic:spPr>
+                      </pic:pic>
+                    </a:graphicData>
+                  </a:graphic>
+                </wp:inline>
+              </w:drawing>
+            </w:r>
+          </w:p>
+          <w:p>
+            <w:pPr>
+              <w:spacing w:before="0" w:after="0" w:line="240" w:lineRule="auto"/>
+              <w:jc w:val="center"/>
+            </w:pPr>
+            <w:r>
+              <w:rPr>
+                <w:rFonts w:ascii="SamsungOne-400" w:hAnsi="SamsungOne-400" w:cs="Times New Roman"/>
+                <w:b/>
+                <w:bCs/>
+                <w:sz w:val="19"/>
+                <w:szCs w:val="19"/>
+              </w:rPr>
+              <w:t xml:space="preserve">Marwan</w:t>
+            </w:r>
+            <w:r>
+              <w:br/>
+            </w:r>
+            <w:r>
+              <w:rPr>
+                <w:rFonts w:ascii="SamsungOne-400" w:hAnsi="SamsungOne-400" w:cs="Times New Roman"/>
+                <w:b/>
+                <w:bCs/>
+                <w:sz w:val="19"/>
+                <w:szCs w:val="19"/>
+              </w:rPr>
+              <w:t xml:space="preserve">Elamami</w:t>
+            </w:r>
+          </w:p>
+        </w:tc>
+        <w:tc>
+          <w:tcPr>
+            <w:tcW w:w="1501" w:type="dxa"/>
+          </w:tcPr>
+          <w:p>
+            <w:pPr>
+              <w:spacing w:before="0" w:after="60" w:line="0" w:lineRule="auto"/>
+              <w:jc w:val="center"/>
+            </w:pPr>
+            <w:r>
+              <w:drawing xmlns:a="http://schemas.openxmlformats.org/drawingml/2006/main" xmlns:pic="http://schemas.openxmlformats.org/drawingml/2006/picture">
+                <wp:inline distT="0" distB="0" distL="0" distR="0">
+                  <wp:extent cx="792000" cy="792000"/>
+                  <wp:effectExtent l="0" t="0" r="0" b="0"/>
+                  <wp:docPr id="1014" name="Figure 1014"/>
+                  <wp:cNvGraphicFramePr>
+                    <a:graphicFrameLocks noChangeAspect="1"/>
+                  </wp:cNvGraphicFramePr>
+                  <a:graphic>
+                    <a:graphicData uri="http://schemas.openxmlformats.org/drawingml/2006/picture">
+                      <pic:pic>
+                        <pic:nvPicPr>
+                          <pic:cNvPr id="1014" name="fig1014.png"/>
+                          <pic:cNvPicPr/>
+                        </pic:nvPicPr>
+                        <pic:blipFill>
+                          <a:blip r:embed="rId213"/>
+                          <a:stretch>
+                            <a:fillRect/>
+                          </a:stretch>
+                        </pic:blipFill>
+                        <pic:spPr>
+                          <a:xfrm>
+                            <a:off x="0" y="0"/>
+                            <a:ext cx="792000" cy="792000"/>
+                          </a:xfrm>
+                          <a:prstGeom prst="rect">
+                            <a:avLst/>
+                          </a:prstGeom>
+                        </pic:spPr>
+                      </pic:pic>
+                    </a:graphicData>
+                  </a:graphic>
+                </wp:inline>
+              </w:drawing>
+            </w:r>
+          </w:p>
+          <w:p>
+            <w:pPr>
+              <w:spacing w:before="0" w:after="0" w:line="240" w:lineRule="auto"/>
+              <w:jc w:val="center"/>
+            </w:pPr>
+            <w:r>
+              <w:rPr>
+                <w:rFonts w:ascii="SamsungOne-400" w:hAnsi="SamsungOne-400" w:cs="Times New Roman"/>
+                <w:b/>
+                <w:bCs/>
+                <w:sz w:val="19"/>
+                <w:szCs w:val="19"/>
+              </w:rPr>
+              <w:t xml:space="preserve">Abdulrahman</w:t>
+            </w:r>
+            <w:r>
+              <w:br/>
+            </w:r>
+            <w:r>
+              <w:rPr>
+                <w:rFonts w:ascii="SamsungOne-400" w:hAnsi="SamsungOne-400" w:cs="Times New Roman"/>
+                <w:b/>
+                <w:bCs/>
+                <w:sz w:val="19"/>
+                <w:szCs w:val="19"/>
+              </w:rPr>
+              <w:t xml:space="preserve">Khengari</w:t>
+            </w:r>
+          </w:p>
+        </w:tc>
+        <w:tc>
+          <w:tcPr>
+            <w:tcW w:w="1501" w:type="dxa"/>
+          </w:tcPr>
+          <w:p>
+            <w:pPr>
+              <w:spacing w:before="0" w:after="60" w:line="0" w:lineRule="auto"/>
+              <w:jc w:val="center"/>
+            </w:pPr>
+            <w:r>
+              <w:drawing xmlns:a="http://schemas.openxmlformats.org/drawingml/2006/main" xmlns:pic="http://schemas.openxmlformats.org/drawingml/2006/picture">
+                <wp:inline distT="0" distB="0" distL="0" distR="0">
+                  <wp:extent cx="792000" cy="792000"/>
+                  <wp:effectExtent l="0" t="0" r="0" b="0"/>
+                  <wp:docPr id="1015" name="Figure 1015"/>
+                  <wp:cNvGraphicFramePr>
+                    <a:graphicFrameLocks noChangeAspect="1"/>
+                  </wp:cNvGraphicFramePr>
+                  <a:graphic>
+                    <a:graphicData uri="http://schemas.openxmlformats.org/drawingml/2006/picture">
+                      <pic:pic>
+                        <pic:nvPicPr>
+                          <pic:cNvPr id="1015" name="fig1015.png"/>
+                          <pic:cNvPicPr/>
+                        </pic:nvPicPr>
+                        <pic:blipFill>
+                          <a:blip r:embed="rId214"/>
+                          <a:stretch>
+                            <a:fillRect/>
+                          </a:stretch>
+                        </pic:blipFill>
+                        <pic:spPr>
+                          <a:xfrm>
+                            <a:off x="0" y="0"/>
+                            <a:ext cx="792000" cy="792000"/>
+                          </a:xfrm>
+                          <a:prstGeom prst="rect">
+                            <a:avLst/>
+                          </a:prstGeom>
+                        </pic:spPr>
+                      </pic:pic>
+                    </a:graphicData>
+                  </a:graphic>
+                </wp:inline>
+              </w:drawing>
+            </w:r>
+          </w:p>
+          <w:p>
+            <w:pPr>
+              <w:spacing w:before="0" w:after="0" w:line="240" w:lineRule="auto"/>
+              <w:jc w:val="center"/>
+            </w:pPr>
+            <w:r>
+              <w:rPr>
+                <w:rFonts w:ascii="SamsungOne-400" w:hAnsi="SamsungOne-400" w:cs="Times New Roman"/>
+                <w:b/>
+                <w:bCs/>
+                <w:sz w:val="19"/>
+                <w:szCs w:val="19"/>
+              </w:rPr>
+              <w:t xml:space="preserve">Ahmed</w:t>
+            </w:r>
+            <w:r>
+              <w:br/>
+            </w:r>
+            <w:r>
+              <w:rPr>
+                <w:rFonts w:ascii="SamsungOne-400" w:hAnsi="SamsungOne-400" w:cs="Times New Roman"/>
+                <w:b/>
+                <w:bCs/>
+                <w:sz w:val="19"/>
+                <w:szCs w:val="19"/>
+              </w:rPr>
+              <w:t xml:space="preserve">Alaeb</w:t>
+            </w:r>
+          </w:p>
+        </w:tc>
+        <w:tc>
+          <w:tcPr>
+            <w:tcW w:w="1501" w:type="dxa"/>
+          </w:tcPr>
+          <w:p>
+            <w:pPr>
+              <w:spacing w:before="0" w:after="60" w:line="0" w:lineRule="auto"/>
+              <w:jc w:val="center"/>
+            </w:pPr>
+            <w:r>
+              <w:drawing xmlns:a="http://schemas.openxmlformats.org/drawingml/2006/main" xmlns:pic="http://schemas.openxmlformats.org/drawingml/2006/picture">
+                <wp:inline distT="0" distB="0" distL="0" distR="0">
+                  <wp:extent cx="792000" cy="792000"/>
+                  <wp:effectExtent l="0" t="0" r="0" b="0"/>
+                  <wp:docPr id="1016" name="Figure 1016"/>
+                  <wp:cNvGraphicFramePr>
+                    <a:graphicFrameLocks noChangeAspect="1"/>
+                  </wp:cNvGraphicFramePr>
+                  <a:graphic>
+                    <a:graphicData uri="http://schemas.openxmlformats.org/drawingml/2006/picture">
+                      <pic:pic>
+                        <pic:nvPicPr>
+                          <pic:cNvPr id="1016" name="fig1016.png"/>
+                          <pic:cNvPicPr/>
+                        </pic:nvPicPr>
+                        <pic:blipFill>
+                          <a:blip r:embed="rId215"/>
+                          <a:stretch>
+                            <a:fillRect/>
+                          </a:stretch>
+                        </pic:blipFill>
+                        <pic:spPr>
+                          <a:xfrm>
+                            <a:off x="0" y="0"/>
+                            <a:ext cx="792000" cy="792000"/>
+                          </a:xfrm>
+                          <a:prstGeom prst="rect">
+                            <a:avLst/>
+                          </a:prstGeom>
+                        </pic:spPr>
+                      </pic:pic>
+                    </a:graphicData>
+                  </a:graphic>
+                </wp:inline>
+              </w:drawing>
+            </w:r>
+          </w:p>
+          <w:p>
+            <w:pPr>
+              <w:spacing w:before="0" w:after="0" w:line="240" w:lineRule="auto"/>
+              <w:jc w:val="center"/>
+            </w:pPr>
+            <w:r>
+              <w:rPr>
+                <w:rFonts w:ascii="SamsungOne-400" w:hAnsi="SamsungOne-400" w:cs="Times New Roman"/>
+                <w:b/>
+                <w:bCs/>
+                <w:sz w:val="19"/>
+                <w:szCs w:val="19"/>
+              </w:rPr>
+              <w:t xml:space="preserve">Sanad</w:t>
+            </w:r>
+            <w:r>
+              <w:br/>
+            </w:r>
+            <w:r>
+              <w:rPr>
+                <w:rFonts w:ascii="SamsungOne-400" w:hAnsi="SamsungOne-400" w:cs="Times New Roman"/>
+                <w:b/>
+                <w:bCs/>
+                <w:sz w:val="19"/>
+                <w:szCs w:val="19"/>
+              </w:rPr>
+              <w:t xml:space="preserve">Ali</w:t>
+            </w:r>
+          </w:p>
+        </w:tc>
+        <w:tc>
+          <w:tcPr>
+            <w:tcW w:w="1501" w:type="dxa"/>
+          </w:tcPr>
+          <w:p>
+            <w:pPr>
+              <w:spacing w:before="0" w:after="60" w:line="0" w:lineRule="auto"/>
+              <w:jc w:val="center"/>
+            </w:pPr>
+            <w:r>
+              <w:drawing xmlns:a="http://schemas.openxmlformats.org/drawingml/2006/main" xmlns:pic="http://schemas.openxmlformats.org/drawingml/2006/picture">
+                <wp:inline distT="0" distB="0" distL="0" distR="0">
+                  <wp:extent cx="792000" cy="792000"/>
+                  <wp:effectExtent l="0" t="0" r="0" b="0"/>
+                  <wp:docPr id="1017" name="Figure 1017"/>
+                  <wp:cNvGraphicFramePr>
+                    <a:graphicFrameLocks noChangeAspect="1"/>
+                  </wp:cNvGraphicFramePr>
+                  <a:graphic>
+                    <a:graphicData uri="http://schemas.openxmlformats.org/drawingml/2006/picture">
+                      <pic:pic>
+                        <pic:nvPicPr>
+                          <pic:cNvPr id="1017" name="fig1017.png"/>
+                          <pic:cNvPicPr/>
+                        </pic:nvPicPr>
+                        <pic:blipFill>
+                          <a:blip r:embed="rId216"/>
+                          <a:stretch>
+                            <a:fillRect/>
+                          </a:stretch>
+                        </pic:blipFill>
+                        <pic:spPr>
+                          <a:xfrm>
+                            <a:off x="0" y="0"/>
+                            <a:ext cx="792000" cy="792000"/>
+                          </a:xfrm>
+                          <a:prstGeom prst="rect">
+                            <a:avLst/>
+                          </a:prstGeom>
+                        </pic:spPr>
+                      </pic:pic>
+                    </a:graphicData>
+                  </a:graphic>
+                </wp:inline>
+              </w:drawing>
+            </w:r>
+          </w:p>
+          <w:p>
+            <w:pPr>
+              <w:spacing w:before="0" w:after="0" w:line="240" w:lineRule="auto"/>
+              <w:jc w:val="center"/>
+            </w:pPr>
+            <w:r>
+              <w:rPr>
+                <w:rFonts w:ascii="SamsungOne-400" w:hAnsi="SamsungOne-400" w:cs="Times New Roman"/>
+                <w:b/>
+                <w:bCs/>
+                <w:sz w:val="19"/>
+                <w:szCs w:val="19"/>
+              </w:rPr>
+              <w:t xml:space="preserve">Mohammed</w:t>
+            </w:r>
+            <w:r>
+              <w:br/>
+            </w:r>
+            <w:r>
+              <w:rPr>
+                <w:rFonts w:ascii="SamsungOne-400" w:hAnsi="SamsungOne-400" w:cs="Times New Roman"/>
+                <w:b/>
+                <w:bCs/>
+                <w:sz w:val="19"/>
+                <w:szCs w:val="19"/>
+              </w:rPr>
+              <w:t xml:space="preserve">Thabet</w:t>
+            </w:r>
+          </w:p>
+        </w:tc>
+        <w:tc>
+          <w:tcPr>
+            <w:tcW w:w="1501" w:type="dxa"/>
+          </w:tcPr>
+          <w:p>
+            <w:pPr>
+              <w:spacing w:before="0" w:after="60" w:line="0" w:lineRule="auto"/>
+              <w:jc w:val="center"/>
+            </w:pPr>
+            <w:r>
+              <w:drawing xmlns:a="http://schemas.openxmlformats.org/drawingml/2006/main" xmlns:pic="http://schemas.openxmlformats.org/drawingml/2006/picture">
+                <wp:inline distT="0" distB="0" distL="0" distR="0">
+                  <wp:extent cx="792000" cy="792000"/>
+                  <wp:effectExtent l="0" t="0" r="0" b="0"/>
+                  <wp:docPr id="1018" name="Figure 1018"/>
+                  <wp:cNvGraphicFramePr>
+                    <a:graphicFrameLocks noChangeAspect="1"/>
+                  </wp:cNvGraphicFramePr>
+                  <a:graphic>
+                    <a:graphicData uri="http://schemas.openxmlformats.org/drawingml/2006/picture">
+                      <pic:pic>
+                        <pic:nvPicPr>
+                          <pic:cNvPr id="1018" name="fig1018.png"/>
+                          <pic:cNvPicPr/>
+                        </pic:nvPicPr>
+                        <pic:blipFill>
+                          <a:blip r:embed="rId217"/>
+                          <a:stretch>
+                            <a:fillRect/>
+                          </a:stretch>
+                        </pic:blipFill>
+                        <pic:spPr>
+                          <a:xfrm>
+                            <a:off x="0" y="0"/>
+                            <a:ext cx="792000" cy="792000"/>
+                          </a:xfrm>
+                          <a:prstGeom prst="rect">
+                            <a:avLst/>
+                          </a:prstGeom>
+                        </pic:spPr>
+                      </pic:pic>
+                    </a:graphicData>
+                  </a:graphic>
+                </wp:inline>
+              </w:drawing>
+            </w:r>
+          </w:p>
+          <w:p>
+            <w:pPr>
+              <w:spacing w:before="0" w:after="0" w:line="240" w:lineRule="auto"/>
+              <w:jc w:val="center"/>
+            </w:pPr>
+            <w:r>
+              <w:rPr>
+                <w:rFonts w:ascii="SamsungOne-400" w:hAnsi="SamsungOne-400" w:cs="Times New Roman"/>
+                <w:b/>
+                <w:bCs/>
+                <w:sz w:val="19"/>
+                <w:szCs w:val="19"/>
+              </w:rPr>
+              <w:t xml:space="preserve">Abdul Majid</w:t>
+            </w:r>
+            <w:r>
+              <w:br/>
+            </w:r>
+            <w:r>
+              <w:rPr>
+                <w:rFonts w:ascii="SamsungOne-400" w:hAnsi="SamsungOne-400" w:cs="Times New Roman"/>
+                <w:b/>
+                <w:bCs/>
+                <w:sz w:val="19"/>
+                <w:szCs w:val="19"/>
+              </w:rPr>
+              <w:t xml:space="preserve">Mraied</w:t>
+            </w:r>
+          </w:p>
         </w:tc>
       </w:tr>
     </w:tbl>
-    <w:sdt>
-      <w:sdtPr>
-        <w:rPr>
-          <w:rFonts w:ascii="SamsungOne-400" w:hAnsi="SamsungOne-400" w:cs="Times New Roman"/>
-          <w:sz w:val="18"/>
-          <w:szCs w:val="20"/>
-        </w:rPr>
-        <w:tag w:val="goog_rdk_416"/>
-        <w:id w:val="628278138"/>
-        <w:showingPlcHdr/>
-      </w:sdtPr>
-      <w:sdtEndPr/>
-      <w:sdtContent>
-        <w:p>
-          <w:pPr>
-            <w:widowControl/>
-            <w:jc w:val="left"/>
-            <w:rPr>
-              <w:rFonts w:ascii="SamsungOne-400" w:hAnsi="SamsungOne-400" w:cs="Times New Roman"/>
-              <w:sz w:val="18"/>
-              <w:szCs w:val="20"/>
-            </w:rPr>
-          </w:pPr>
-          <w:r>
-            <w:rPr>
-              <w:rFonts w:ascii="SamsungOne-400" w:hAnsi="SamsungOne-400" w:cs="Times New Roman"/>
-              <w:sz w:val="18"/>
-              <w:szCs w:val="20"/>
-            </w:rPr>
-            <w:t xml:space="preserve">     </w:t>
-          </w:r>
-        </w:p>
-      </w:sdtContent>
-    </w:sdt>
+    <w:p>
+      <w:pPr>
+        <w:spacing w:before="40" w:after="160" w:line="240" w:lineRule="auto"/>
+        <w:jc w:val="center"/>
+      </w:pPr>
+      <w:r>
+        <w:rPr>
+          <w:rFonts w:ascii="SamsungOne-400" w:hAnsi="SamsungOne-400" w:cs="Times New Roman"/>
+          <w:sz w:val="19"/>
+          <w:szCs w:val="19"/>
+        </w:rPr>
+        <w:t xml:space="preserve">Team Cogni</w:t>
+      </w:r>
+    </w:p>
     <w:tbl>
       <w:tblPr>
-        <w:tblStyle w:val="afa"/>
         <w:tblW w:w="9010" w:type="dxa"/>
+        <w:tblLayout w:type="fixed"/>
         <w:tblBorders>
-          <w:top w:val="single" w:sz="4" w:space="0" w:color="BFBFBF" w:themeColor="background1" w:themeShade="BF"/>
-          <w:left w:val="single" w:sz="4" w:space="0" w:color="BFBFBF" w:themeColor="background1" w:themeShade="BF"/>
-          <w:bottom w:val="single" w:sz="4" w:space="0" w:color="BFBFBF" w:themeColor="background1" w:themeShade="BF"/>
-          <w:right w:val="single" w:sz="4" w:space="0" w:color="BFBFBF" w:themeColor="background1" w:themeShade="BF"/>
-          <w:insideH w:val="single" w:sz="4" w:space="0" w:color="BFBFBF" w:themeColor="background1" w:themeShade="BF"/>
-          <w:insideV w:val="single" w:sz="4" w:space="0" w:color="BFBFBF" w:themeColor="background1" w:themeShade="BF"/>
+          <w:top w:val="single" w:sz="4" w:color="BFBFBF"/>
+          <w:left w:val="single" w:sz="4" w:color="BFBFBF"/>
+          <w:bottom w:val="single" w:sz="4" w:color="BFBFBF"/>
+          <w:right w:val="single" w:sz="4" w:color="BFBFBF"/>
+          <w:insideH w:val="single" w:sz="4" w:color="BFBFBF"/>
+          <w:insideV w:val="single" w:sz="4" w:color="BFBFBF"/>
         </w:tblBorders>
-        <w:tblLayout w:type="fixed"/>
-        <w:tblLook w:val="0400" w:firstRow="0" w:lastRow="0" w:firstColumn="0" w:lastColumn="0" w:noHBand="0" w:noVBand="1"/>
+        <w:tblCellMar>
+          <w:top w:w="40" w:type="dxa"/>
+          <w:left w:w="40" w:type="dxa"/>
+          <w:bottom w:w="40" w:type="dxa"/>
+          <w:right w:w="40" w:type="dxa"/>
+        </w:tblCellMar>
       </w:tblPr>
       <w:tblGrid>
-        <w:gridCol w:w="1384"/>
-        <w:gridCol w:w="7626"/>
+        <w:gridCol w:w="2447"/>
+        <w:gridCol w:w="6563"/>
       </w:tblGrid>
       <w:tr>
         <w:trPr>
-          <w:trHeight w:val="390"/>
           <w:cantSplit/>
           <w:tblHeader/>
         </w:trPr>
         <w:tc>
           <w:tcPr>
-            <w:tcW w:w="1384" w:type="dxa"/>
+            <w:tcW w:w="2447" w:type="dxa"/>
+            <w:tcBorders>
+              <w:top w:val="single" w:sz="4" w:color="BFBFBF"/>
+              <w:left w:val="single" w:sz="4" w:color="BFBFBF"/>
+              <w:bottom w:val="single" w:sz="4" w:color="BFBFBF"/>
+              <w:right w:val="single" w:sz="4" w:color="BFBFBF"/>
+            </w:tcBorders>
             <w:shd w:val="clear" w:color="auto" w:fill="DEE5FA"/>
-            <w:vAlign w:val="center"/>
-          </w:tcPr>
-          <w:sdt>
-            <w:sdtPr>
-              <w:rPr>
-                <w:rFonts w:ascii="SamsungOne-700" w:hAnsi="SamsungOne-700" w:cs="Times New Roman"/>
+          </w:tcPr>
+          <w:p>
+            <w:pPr>
+              <w:spacing w:before="0" w:after="20" w:line="240" w:lineRule="exact"/>
+            </w:pPr>
+            <w:r>
+              <w:rPr>
+                <w:rFonts w:ascii="SamsungOne-400" w:hAnsi="SamsungOne-400" w:cs="Times New Roman"/>
+                <w:b/>
                 <w:bCs/>
-                <w:color w:val="000000" w:themeColor="text1" w:themeShade="BF"/>
-                <w:sz w:val="24"/>
-                <w:szCs w:val="24"/>
-              </w:rPr>
-              <w:tag w:val="goog_rdk_424"/>
-              <w:id w:val="-826752042"/>
-            </w:sdtPr>
-            <w:sdtEndPr/>
-            <w:sdtContent>
-              <w:p>
-                <w:pPr>
-                  <w:widowControl/>
-                  <w:jc w:val="center"/>
-                  <w:rPr>
-                    <w:rFonts w:ascii="SamsungOne-700" w:hAnsi="SamsungOne-700" w:cs="Times New Roman"/>
-                    <w:bCs/>
-                    <w:color w:val="000000" w:themeColor="text1" w:themeShade="BF"/>
-                    <w:sz w:val="24"/>
-                    <w:szCs w:val="24"/>
-                  </w:rPr>
-                </w:pPr>
-                <w:r>
-                  <w:rPr>
-                    <w:rFonts w:ascii="SamsungOne-700" w:hAnsi="SamsungOne-700" w:cs="Times New Roman"/>
-                    <w:bCs/>
-                    <w:color w:val="000000" w:themeColor="text1" w:themeShade="BF"/>
-                    <w:sz w:val="24"/>
-                    <w:szCs w:val="24"/>
-                  </w:rPr>
-                  <w:t>NAME</w:t>
-                </w:r>
-              </w:p>
-            </w:sdtContent>
-          </w:sdt>
-        </w:tc>
-        <w:tc>
-          <w:tcPr>
-            <w:tcW w:w="7626" w:type="dxa"/>
+                <w:sz w:val="20"/>
+                <w:szCs w:val="20"/>
+              </w:rPr>
+              <w:t xml:space="preserve">NAME</w:t>
+            </w:r>
+          </w:p>
+        </w:tc>
+        <w:tc>
+          <w:tcPr>
+            <w:tcW w:w="6563" w:type="dxa"/>
+            <w:tcBorders>
+              <w:top w:val="single" w:sz="4" w:color="BFBFBF"/>
+              <w:left w:val="single" w:sz="4" w:color="BFBFBF"/>
+              <w:bottom w:val="single" w:sz="4" w:color="BFBFBF"/>
+              <w:right w:val="single" w:sz="4" w:color="BFBFBF"/>
+            </w:tcBorders>
             <w:shd w:val="clear" w:color="auto" w:fill="DEE5FA"/>
-            <w:vAlign w:val="center"/>
-          </w:tcPr>
-          <w:sdt>
-            <w:sdtPr>
-              <w:rPr>
-                <w:rFonts w:ascii="SamsungOne-700" w:hAnsi="SamsungOne-700" w:cs="Times New Roman"/>
+          </w:tcPr>
+          <w:p>
+            <w:pPr>
+              <w:spacing w:before="0" w:after="20" w:line="240" w:lineRule="exact"/>
+            </w:pPr>
+            <w:r>
+              <w:rPr>
+                <w:rFonts w:ascii="SamsungOne-400" w:hAnsi="SamsungOne-400" w:cs="Times New Roman"/>
+                <w:b/>
                 <w:bCs/>
-                <w:color w:val="000000" w:themeColor="text1" w:themeShade="BF"/>
-                <w:sz w:val="24"/>
-                <w:szCs w:val="24"/>
-              </w:rPr>
-              <w:tag w:val="goog_rdk_424"/>
-              <w:id w:val="464086223"/>
-            </w:sdtPr>
-            <w:sdtEndPr/>
-            <w:sdtContent>
-              <w:p>
-                <w:pPr>
-                  <w:widowControl/>
-                  <w:jc w:val="center"/>
-                  <w:rPr>
-                    <w:rFonts w:ascii="SamsungOne-700" w:hAnsi="SamsungOne-700" w:cs="Times New Roman"/>
-                    <w:bCs/>
-                    <w:color w:val="000000" w:themeColor="text1" w:themeShade="BF"/>
-                    <w:sz w:val="24"/>
-                    <w:szCs w:val="24"/>
-                  </w:rPr>
-                </w:pPr>
-                <w:r>
-                  <w:rPr>
-                    <w:rFonts w:ascii="SamsungOne-700" w:hAnsi="SamsungOne-700" w:cs="Times New Roman"/>
-                    <w:bCs/>
-                    <w:color w:val="000000" w:themeColor="text1" w:themeShade="BF"/>
-                    <w:sz w:val="24"/>
-                    <w:szCs w:val="24"/>
-                  </w:rPr>
-                  <w:t>REVIEW</w:t>
-                </w:r>
-                <w:r>
-                  <w:rPr>
-                    <w:rFonts w:ascii="SamsungOne-700" w:hAnsi="SamsungOne-700" w:cs="Times New Roman"/>
-                    <w:bCs/>
-                    <w:color w:val="000000" w:themeColor="text1" w:themeShade="BF"/>
-                    <w:sz w:val="24"/>
-                    <w:szCs w:val="24"/>
-                  </w:rPr>
-                  <w:t xml:space="preserve"> and COMMENT</w:t>
-                </w:r>
-              </w:p>
-            </w:sdtContent>
-          </w:sdt>
+                <w:sz w:val="20"/>
+                <w:szCs w:val="20"/>
+              </w:rPr>
+              <w:t xml:space="preserve">REVIEW and COMMENT</w:t>
+            </w:r>
+          </w:p>
         </w:tc>
       </w:tr>
       <w:tr>
         <w:trPr>
-          <w:trHeight w:val="390"/>
           <w:cantSplit/>
         </w:trPr>
         <w:tc>
           <w:tcPr>
-            <w:tcW w:w="1384" w:type="dxa"/>
-            <w:vAlign w:val="center"/>
-          </w:tcPr>
-          <w:p>
-            <w:pPr>
-              <w:widowControl/>
-              <w:jc w:val="center"/>
-              <w:rPr>
-                <w:rFonts w:ascii="SamsungOne-400" w:hAnsi="SamsungOne-400" w:cs="Times New Roman"/>
-                <w:sz w:val="22"/>
-              </w:rPr>
-            </w:pPr>
-          </w:p>
-        </w:tc>
-        <w:tc>
-          <w:tcPr>
-            <w:tcW w:w="7626" w:type="dxa"/>
-            <w:vAlign w:val="center"/>
-          </w:tcPr>
-          <w:p>
-            <w:pPr>
-              <w:widowControl/>
-              <w:jc w:val="left"/>
-              <w:rPr>
-                <w:rFonts w:ascii="SamsungOne-400" w:hAnsi="SamsungOne-400" w:cs="Times New Roman"/>
-                <w:sz w:val="22"/>
-              </w:rPr>
-            </w:pPr>
+            <w:tcW w:w="2447" w:type="dxa"/>
+            <w:tcBorders>
+              <w:top w:val="single" w:sz="4" w:color="BFBFBF"/>
+              <w:left w:val="single" w:sz="4" w:color="BFBFBF"/>
+              <w:bottom w:val="single" w:sz="4" w:color="BFBFBF"/>
+              <w:right w:val="single" w:sz="4" w:color="BFBFBF"/>
+            </w:tcBorders>
+          </w:tcPr>
+          <w:p>
+            <w:pPr>
+              <w:spacing w:before="0" w:after="20" w:line="240" w:lineRule="exact"/>
+            </w:pPr>
+            <w:r>
+              <w:rPr>
+                <w:rFonts w:ascii="SamsungOne-400" w:hAnsi="SamsungOne-400" w:cs="Times New Roman"/>
+                <w:sz w:val="20"/>
+                <w:szCs w:val="20"/>
+              </w:rPr>
+              <w:t xml:space="preserve">Marwan Elamami</w:t>
+            </w:r>
+          </w:p>
+        </w:tc>
+        <w:tc>
+          <w:tcPr>
+            <w:tcW w:w="6563" w:type="dxa"/>
+            <w:tcBorders>
+              <w:top w:val="single" w:sz="4" w:color="BFBFBF"/>
+              <w:left w:val="single" w:sz="4" w:color="BFBFBF"/>
+              <w:bottom w:val="single" w:sz="4" w:color="BFBFBF"/>
+              <w:right w:val="single" w:sz="4" w:color="BFBFBF"/>
+            </w:tcBorders>
+          </w:tcPr>
+          <w:p>
+            <w:pPr>
+              <w:spacing w:before="0" w:after="20" w:line="240" w:lineRule="exact"/>
+            </w:pPr>
+            <w:r>
+              <w:rPr>
+                <w:rFonts w:ascii="SamsungOne-400" w:hAnsi="SamsungOne-400" w:cs="Times New Roman"/>
+                <w:sz w:val="20"/>
+                <w:szCs w:val="20"/>
+              </w:rPr>
+              <w:t xml:space="preserve">Leading Bayan taught me that the hard part of an AI product is knowing whether it works. I am proudest that we built a benchmark for the task, checked it against people, and let the numbers change our decisions, which is how BayanSimplify-v0.3 with four beams became the app's large model. Next, I want readers with dyslexia to use the app and to measure their reading itself.</w:t>
+            </w:r>
           </w:p>
         </w:tc>
       </w:tr>
       <w:tr>
         <w:trPr>
-          <w:trHeight w:val="390"/>
           <w:cantSplit/>
         </w:trPr>
         <w:tc>
           <w:tcPr>
-            <w:tcW w:w="1384" w:type="dxa"/>
-            <w:vAlign w:val="center"/>
-          </w:tcPr>
-          <w:p>
-            <w:pPr>
-              <w:widowControl/>
-              <w:jc w:val="center"/>
-              <w:rPr>
-                <w:rFonts w:ascii="SamsungOne-400" w:hAnsi="SamsungOne-400" w:cs="Times New Roman"/>
-                <w:sz w:val="22"/>
-              </w:rPr>
-            </w:pPr>
-          </w:p>
-        </w:tc>
-        <w:tc>
-          <w:tcPr>
-            <w:tcW w:w="7626" w:type="dxa"/>
-            <w:vAlign w:val="center"/>
-          </w:tcPr>
-          <w:p>
-            <w:pPr>
-              <w:widowControl/>
-              <w:jc w:val="center"/>
-              <w:rPr>
-                <w:rFonts w:ascii="SamsungOne-400" w:hAnsi="SamsungOne-400" w:cs="Times New Roman"/>
-                <w:sz w:val="22"/>
-              </w:rPr>
-            </w:pPr>
+            <w:tcW w:w="2447" w:type="dxa"/>
+            <w:tcBorders>
+              <w:top w:val="single" w:sz="4" w:color="BFBFBF"/>
+              <w:left w:val="single" w:sz="4" w:color="BFBFBF"/>
+              <w:bottom w:val="single" w:sz="4" w:color="BFBFBF"/>
+              <w:right w:val="single" w:sz="4" w:color="BFBFBF"/>
+            </w:tcBorders>
+          </w:tcPr>
+          <w:p>
+            <w:pPr>
+              <w:spacing w:before="0" w:after="20" w:line="240" w:lineRule="exact"/>
+            </w:pPr>
+            <w:r>
+              <w:rPr>
+                <w:rFonts w:ascii="SamsungOne-400" w:hAnsi="SamsungOne-400" w:cs="Times New Roman"/>
+                <w:sz w:val="20"/>
+                <w:szCs w:val="20"/>
+              </w:rPr>
+              <w:t xml:space="preserve">Abdulrahman Khengari</w:t>
+            </w:r>
+          </w:p>
+        </w:tc>
+        <w:tc>
+          <w:tcPr>
+            <w:tcW w:w="6563" w:type="dxa"/>
+            <w:tcBorders>
+              <w:top w:val="single" w:sz="4" w:color="BFBFBF"/>
+              <w:left w:val="single" w:sz="4" w:color="BFBFBF"/>
+              <w:bottom w:val="single" w:sz="4" w:color="BFBFBF"/>
+              <w:right w:val="single" w:sz="4" w:color="BFBFBF"/>
+            </w:tcBorders>
+          </w:tcPr>
+          <w:p>
+            <w:pPr>
+              <w:spacing w:before="0" w:after="20" w:line="240" w:lineRule="exact"/>
+            </w:pPr>
+            <w:r>
+              <w:rPr>
+                <w:rFonts w:ascii="SamsungOne-400" w:hAnsi="SamsungOne-400" w:cs="Times New Roman"/>
+                <w:sz w:val="20"/>
+                <w:szCs w:val="20"/>
+              </w:rPr>
+              <w:t xml:space="preserve">I built the data side, from the first synthetic corpus to corpus v1, the meaning judge and BayanSimplify-v0.3, and the benchmark report that compared 35 systems on the same rules. Measuring every variant the same way is what showed that BayanSimplify-v0.3 with four beams is our best model.</w:t>
+            </w:r>
           </w:p>
         </w:tc>
       </w:tr>
       <w:tr>
         <w:trPr>
-          <w:trHeight w:val="390"/>
           <w:cantSplit/>
         </w:trPr>
         <w:tc>
           <w:tcPr>
-            <w:tcW w:w="1384" w:type="dxa"/>
-            <w:vAlign w:val="center"/>
-          </w:tcPr>
-          <w:p>
-            <w:pPr>
-              <w:widowControl/>
-              <w:jc w:val="center"/>
-              <w:rPr>
-                <w:rFonts w:ascii="SamsungOne-400" w:hAnsi="SamsungOne-400" w:cs="Times New Roman"/>
-                <w:sz w:val="22"/>
-              </w:rPr>
-            </w:pPr>
-          </w:p>
-        </w:tc>
-        <w:tc>
-          <w:tcPr>
-            <w:tcW w:w="7626" w:type="dxa"/>
-            <w:vAlign w:val="center"/>
-          </w:tcPr>
-          <w:p>
-            <w:pPr>
-              <w:widowControl/>
-              <w:jc w:val="left"/>
-              <w:rPr>
-                <w:rFonts w:ascii="SamsungOne-400" w:hAnsi="SamsungOne-400" w:cs="Times New Roman"/>
-                <w:sz w:val="22"/>
-              </w:rPr>
-            </w:pPr>
+            <w:tcW w:w="2447" w:type="dxa"/>
+            <w:tcBorders>
+              <w:top w:val="single" w:sz="4" w:color="BFBFBF"/>
+              <w:left w:val="single" w:sz="4" w:color="BFBFBF"/>
+              <w:bottom w:val="single" w:sz="4" w:color="BFBFBF"/>
+              <w:right w:val="single" w:sz="4" w:color="BFBFBF"/>
+            </w:tcBorders>
+          </w:tcPr>
+          <w:p>
+            <w:pPr>
+              <w:spacing w:before="0" w:after="20" w:line="240" w:lineRule="exact"/>
+            </w:pPr>
+            <w:r>
+              <w:rPr>
+                <w:rFonts w:ascii="SamsungOne-400" w:hAnsi="SamsungOne-400" w:cs="Times New Roman"/>
+                <w:sz w:val="20"/>
+                <w:szCs w:val="20"/>
+              </w:rPr>
+              <w:t xml:space="preserve">Ahmed Alaeb</w:t>
+            </w:r>
+          </w:p>
+        </w:tc>
+        <w:tc>
+          <w:tcPr>
+            <w:tcW w:w="6563" w:type="dxa"/>
+            <w:tcBorders>
+              <w:top w:val="single" w:sz="4" w:color="BFBFBF"/>
+              <w:left w:val="single" w:sz="4" w:color="BFBFBF"/>
+              <w:bottom w:val="single" w:sz="4" w:color="BFBFBF"/>
+              <w:right w:val="single" w:sz="4" w:color="BFBFBF"/>
+            </w:tcBorders>
+          </w:tcPr>
+          <w:p>
+            <w:pPr>
+              <w:spacing w:before="0" w:after="20" w:line="240" w:lineRule="exact"/>
+            </w:pPr>
+            <w:r>
+              <w:rPr>
+                <w:rFonts w:ascii="SamsungOne-400" w:hAnsi="SamsungOne-400" w:cs="Times New Roman"/>
+                <w:sz w:val="20"/>
+                <w:szCs w:val="20"/>
+              </w:rPr>
+              <w:t xml:space="preserve">Training BayanSimplify-v0.1 and the v0.2 models showed me how much the data decides: SAMER taught word swaps, while the corpora we built taught the model to restructure. I am glad the model work ended in an app that runs offline on an ordinary phone.</w:t>
+            </w:r>
           </w:p>
         </w:tc>
       </w:tr>
       <w:tr>
         <w:trPr>
-          <w:trHeight w:val="390"/>
           <w:cantSplit/>
         </w:trPr>
         <w:tc>
           <w:tcPr>
-            <w:tcW w:w="1384" w:type="dxa"/>
-            <w:vAlign w:val="center"/>
-          </w:tcPr>
-          <w:p>
-            <w:pPr>
-              <w:widowControl/>
-              <w:jc w:val="center"/>
-              <w:rPr>
-                <w:rFonts w:ascii="SamsungOne-400" w:hAnsi="SamsungOne-400" w:cs="Times New Roman"/>
-                <w:sz w:val="22"/>
-              </w:rPr>
-            </w:pPr>
-          </w:p>
-        </w:tc>
-        <w:tc>
-          <w:tcPr>
-            <w:tcW w:w="7626" w:type="dxa"/>
-            <w:vAlign w:val="center"/>
-          </w:tcPr>
-          <w:p>
-            <w:pPr>
-              <w:widowControl/>
-              <w:jc w:val="left"/>
-              <w:rPr>
-                <w:rFonts w:ascii="SamsungOne-400" w:hAnsi="SamsungOne-400" w:cs="Times New Roman"/>
-                <w:sz w:val="22"/>
-              </w:rPr>
-            </w:pPr>
+            <w:tcW w:w="2447" w:type="dxa"/>
+            <w:tcBorders>
+              <w:top w:val="single" w:sz="4" w:color="BFBFBF"/>
+              <w:left w:val="single" w:sz="4" w:color="BFBFBF"/>
+              <w:bottom w:val="single" w:sz="4" w:color="BFBFBF"/>
+              <w:right w:val="single" w:sz="4" w:color="BFBFBF"/>
+            </w:tcBorders>
+          </w:tcPr>
+          <w:p>
+            <w:pPr>
+              <w:spacing w:before="0" w:after="20" w:line="240" w:lineRule="exact"/>
+            </w:pPr>
+            <w:r>
+              <w:rPr>
+                <w:rFonts w:ascii="SamsungOne-400" w:hAnsi="SamsungOne-400" w:cs="Times New Roman"/>
+                <w:sz w:val="20"/>
+                <w:szCs w:val="20"/>
+              </w:rPr>
+              <w:t xml:space="preserve">Sanad Ali</w:t>
+            </w:r>
+          </w:p>
+        </w:tc>
+        <w:tc>
+          <w:tcPr>
+            <w:tcW w:w="6563" w:type="dxa"/>
+            <w:tcBorders>
+              <w:top w:val="single" w:sz="4" w:color="BFBFBF"/>
+              <w:left w:val="single" w:sz="4" w:color="BFBFBF"/>
+              <w:bottom w:val="single" w:sz="4" w:color="BFBFBF"/>
+              <w:right w:val="single" w:sz="4" w:color="BFBFBF"/>
+            </w:tcBorders>
+          </w:tcPr>
+          <w:p>
+            <w:pPr>
+              <w:spacing w:before="0" w:after="20" w:line="240" w:lineRule="exact"/>
+            </w:pPr>
+            <w:r>
+              <w:rPr>
+                <w:rFonts w:ascii="SamsungOne-400" w:hAnsi="SamsungOne-400" w:cs="Times New Roman"/>
+                <w:sz w:val="20"/>
+                <w:szCs w:val="20"/>
+              </w:rPr>
+              <w:t xml:space="preserve">I benchmarked the diacritizers and chose Libtashkeel, which now adds tashkeel in the app without changing a letter, and trained BayanSimplify-v0.2-Fast (AraBART), whose speed made it the fast default.</w:t>
+            </w:r>
           </w:p>
         </w:tc>
       </w:tr>
       <w:tr>
         <w:trPr>
-          <w:trHeight w:val="390"/>
           <w:cantSplit/>
         </w:trPr>
         <w:tc>
           <w:tcPr>
-            <w:tcW w:w="1384" w:type="dxa"/>
-            <w:vAlign w:val="center"/>
-          </w:tcPr>
-          <w:p>
-            <w:pPr>
-              <w:widowControl/>
-              <w:jc w:val="center"/>
-              <w:rPr>
-                <w:rFonts w:ascii="SamsungOne-400" w:hAnsi="SamsungOne-400" w:cs="Times New Roman"/>
-                <w:sz w:val="22"/>
-              </w:rPr>
-            </w:pPr>
-          </w:p>
-        </w:tc>
-        <w:tc>
-          <w:tcPr>
-            <w:tcW w:w="7626" w:type="dxa"/>
-            <w:vAlign w:val="center"/>
-          </w:tcPr>
-          <w:p>
-            <w:pPr>
-              <w:widowControl/>
-              <w:jc w:val="left"/>
-              <w:rPr>
-                <w:rFonts w:ascii="SamsungOne-400" w:hAnsi="SamsungOne-400" w:cs="Times New Roman"/>
-                <w:sz w:val="22"/>
-              </w:rPr>
-            </w:pPr>
+            <w:tcW w:w="2447" w:type="dxa"/>
+            <w:tcBorders>
+              <w:top w:val="single" w:sz="4" w:color="BFBFBF"/>
+              <w:left w:val="single" w:sz="4" w:color="BFBFBF"/>
+              <w:bottom w:val="single" w:sz="4" w:color="BFBFBF"/>
+              <w:right w:val="single" w:sz="4" w:color="BFBFBF"/>
+            </w:tcBorders>
+          </w:tcPr>
+          <w:p>
+            <w:pPr>
+              <w:spacing w:before="0" w:after="20" w:line="240" w:lineRule="exact"/>
+            </w:pPr>
+            <w:r>
+              <w:rPr>
+                <w:rFonts w:ascii="SamsungOne-400" w:hAnsi="SamsungOne-400" w:cs="Times New Roman"/>
+                <w:sz w:val="20"/>
+                <w:szCs w:val="20"/>
+              </w:rPr>
+              <w:t xml:space="preserve">Mohammed Thabet</w:t>
+            </w:r>
+          </w:p>
+        </w:tc>
+        <w:tc>
+          <w:tcPr>
+            <w:tcW w:w="6563" w:type="dxa"/>
+            <w:tcBorders>
+              <w:top w:val="single" w:sz="4" w:color="BFBFBF"/>
+              <w:left w:val="single" w:sz="4" w:color="BFBFBF"/>
+              <w:bottom w:val="single" w:sz="4" w:color="BFBFBF"/>
+              <w:right w:val="single" w:sz="4" w:color="BFBFBF"/>
+            </w:tcBorders>
+          </w:tcPr>
+          <w:p>
+            <w:pPr>
+              <w:spacing w:before="0" w:after="20" w:line="240" w:lineRule="exact"/>
+            </w:pPr>
+            <w:r>
+              <w:rPr>
+                <w:rFonts w:ascii="SamsungOne-400" w:hAnsi="SamsungOne-400" w:cs="Times New Roman"/>
+                <w:sz w:val="20"/>
+                <w:szCs w:val="20"/>
+              </w:rPr>
+              <w:t xml:space="preserve">Building the Android side, from the selection menu and the result sheet to model downloads and typography settings, showed me how much a reading tool depends on small details: spacing, clear states, and never losing the reader's place.</w:t>
+            </w:r>
+          </w:p>
+        </w:tc>
+      </w:tr>
+      <w:tr>
+        <w:trPr>
+          <w:cantSplit/>
+        </w:trPr>
+        <w:tc>
+          <w:tcPr>
+            <w:tcW w:w="2447" w:type="dxa"/>
+            <w:tcBorders>
+              <w:top w:val="single" w:sz="4" w:color="BFBFBF"/>
+              <w:left w:val="single" w:sz="4" w:color="BFBFBF"/>
+              <w:bottom w:val="single" w:sz="4" w:color="BFBFBF"/>
+              <w:right w:val="single" w:sz="4" w:color="BFBFBF"/>
+            </w:tcBorders>
+          </w:tcPr>
+          <w:p>
+            <w:pPr>
+              <w:spacing w:before="0" w:after="20" w:line="240" w:lineRule="exact"/>
+            </w:pPr>
+            <w:r>
+              <w:rPr>
+                <w:rFonts w:ascii="SamsungOne-400" w:hAnsi="SamsungOne-400" w:cs="Times New Roman"/>
+                <w:sz w:val="20"/>
+                <w:szCs w:val="20"/>
+              </w:rPr>
+              <w:t xml:space="preserve">Abdul Majid Mraied</w:t>
+            </w:r>
+          </w:p>
+        </w:tc>
+        <w:tc>
+          <w:tcPr>
+            <w:tcW w:w="6563" w:type="dxa"/>
+            <w:tcBorders>
+              <w:top w:val="single" w:sz="4" w:color="BFBFBF"/>
+              <w:left w:val="single" w:sz="4" w:color="BFBFBF"/>
+              <w:bottom w:val="single" w:sz="4" w:color="BFBFBF"/>
+              <w:right w:val="single" w:sz="4" w:color="BFBFBF"/>
+            </w:tcBorders>
+          </w:tcPr>
+          <w:p>
+            <w:pPr>
+              <w:spacing w:before="0" w:after="20" w:line="240" w:lineRule="exact"/>
+            </w:pPr>
+            <w:r>
+              <w:rPr>
+                <w:rFonts w:ascii="SamsungOne-400" w:hAnsi="SamsungOne-400" w:cs="Times New Roman"/>
+                <w:sz w:val="20"/>
+                <w:szCs w:val="20"/>
+              </w:rPr>
+              <w:t xml:space="preserve">My part was the evaluation groundwork: scoring and leakage scripts, the locked test sets and the copy baselines. They make sure a score in this report measures what it claims to.</w:t>
+            </w:r>
           </w:p>
         </w:tc>
       </w:tr>
     </w:tbl>
-    <w:sdt>
-      <w:sdtPr>
-        <w:rPr>
-          <w:rFonts w:ascii="SamsungOne-400" w:hAnsi="SamsungOne-400" w:cs="Times New Roman"/>
-          <w:sz w:val="18"/>
-          <w:szCs w:val="20"/>
-        </w:rPr>
-        <w:tag w:val="goog_rdk_464"/>
-        <w:id w:val="-1439451538"/>
-        <w:showingPlcHdr/>
-      </w:sdtPr>
-      <w:sdtEndPr/>
-      <w:sdtContent>
-        <w:p>
-          <w:pPr>
-            <w:widowControl/>
-            <w:jc w:val="left"/>
-            <w:rPr>
-              <w:rFonts w:ascii="SamsungOne-400" w:hAnsi="SamsungOne-400" w:cs="Times New Roman"/>
-              <w:sz w:val="28"/>
-              <w:szCs w:val="28"/>
-            </w:rPr>
-          </w:pPr>
-          <w:r>
-            <w:rPr>
-              <w:rFonts w:ascii="SamsungOne-400" w:hAnsi="SamsungOne-400" w:cs="Times New Roman"/>
-              <w:sz w:val="18"/>
-              <w:szCs w:val="20"/>
-            </w:rPr>
-            <w:t xml:space="preserve">     </w:t>
-          </w:r>
-        </w:p>
-      </w:sdtContent>
-    </w:sdt>
     <w:sdt>
       <w:sdtPr>
         <w:rPr>

</xml_diff>